<commit_message>
úpravy gpx v Samples
</commit_message>
<xml_diff>
--- a/K9TrailsAnalyzer/Resources/Pravidla_zavodu.docx
+++ b/K9TrailsAnalyzer/Resources/Pravidla_zavodu.docx
@@ -1103,10 +1103,600 @@
       </w:r>
     </w:p>
     <w:p>
+      <w:r>
+        <w:br w:type="page"/>
+      </w:r>
+    </w:p>
+    <w:p>
+      <w:pPr>
+        <w:rPr>
+          <w:b/>
+          <w:bCs/>
+          <w:color w:val="2E5396"/>
+          <w:sz w:val="32"/>
+          <w:szCs w:val="32"/>
+        </w:rPr>
+      </w:pPr>
+      <w:r>
+        <w:rPr>
+          <w:b/>
+          <w:bCs/>
+          <w:color w:val="2E5396"/>
+          <w:sz w:val="32"/>
+          <w:szCs w:val="32"/>
+        </w:rPr>
+        <w:lastRenderedPageBreak/>
+        <w:t xml:space="preserve">Příklady </w:t>
+      </w:r>
+      <w:r>
+        <w:rPr>
+          <w:b/>
+          <w:bCs/>
+          <w:color w:val="2E5396"/>
+          <w:sz w:val="32"/>
+          <w:szCs w:val="32"/>
+        </w:rPr>
+        <w:t>t</w:t>
+      </w:r>
+      <w:r>
+        <w:rPr>
+          <w:b/>
+          <w:bCs/>
+          <w:color w:val="2E5396"/>
+          <w:sz w:val="32"/>
+          <w:szCs w:val="32"/>
+        </w:rPr>
+        <w:t>railů a bodového hodnocení</w:t>
+      </w:r>
+    </w:p>
+    <w:p>
+      <w:pPr>
+        <w:rPr>
+          <w:b/>
+          <w:bCs/>
+          <w:color w:val="2E5396"/>
+          <w:sz w:val="32"/>
+          <w:szCs w:val="32"/>
+        </w:rPr>
+      </w:pPr>
+    </w:p>
+    <w:p>
+      <w:pPr>
+        <w:rPr>
+          <w:b/>
+          <w:bCs/>
+          <w:color w:val="2E5396"/>
+          <w:sz w:val="32"/>
+          <w:szCs w:val="32"/>
+        </w:rPr>
+      </w:pPr>
+      <w:r>
+        <w:rPr>
+          <w:b/>
+          <w:bCs/>
+          <w:noProof/>
+          <w:color w:val="2E5396"/>
+          <w:sz w:val="32"/>
+          <w:szCs w:val="32"/>
+        </w:rPr>
+        <w:drawing>
+          <wp:inline distT="0" distB="0" distL="0" distR="0" wp14:anchorId="3F3D564B" wp14:editId="008655DD">
+            <wp:extent cx="2590800" cy="1617392"/>
+            <wp:effectExtent l="0" t="0" r="0" b="1905"/>
+            <wp:docPr id="1329373794" name="Obrázek 1"/>
+            <wp:cNvGraphicFramePr>
+              <a:graphicFrameLocks xmlns:a="http://schemas.openxmlformats.org/drawingml/2006/main" noChangeAspect="1"/>
+            </wp:cNvGraphicFramePr>
+            <a:graphic xmlns:a="http://schemas.openxmlformats.org/drawingml/2006/main">
+              <a:graphicData uri="http://schemas.openxmlformats.org/drawingml/2006/picture">
+                <pic:pic xmlns:pic="http://schemas.openxmlformats.org/drawingml/2006/picture">
+                  <pic:nvPicPr>
+                    <pic:cNvPr id="0" name="Picture 1"/>
+                    <pic:cNvPicPr>
+                      <a:picLocks noChangeAspect="1" noChangeArrowheads="1"/>
+                    </pic:cNvPicPr>
+                  </pic:nvPicPr>
+                  <pic:blipFill>
+                    <a:blip r:embed="rId8" cstate="print">
+                      <a:extLst>
+                        <a:ext uri="{28A0092B-C50C-407E-A947-70E740481C1C}">
+                          <a14:useLocalDpi xmlns:a14="http://schemas.microsoft.com/office/drawing/2010/main" val="0"/>
+                        </a:ext>
+                      </a:extLst>
+                    </a:blip>
+                    <a:srcRect/>
+                    <a:stretch>
+                      <a:fillRect/>
+                    </a:stretch>
+                  </pic:blipFill>
+                  <pic:spPr bwMode="auto">
+                    <a:xfrm>
+                      <a:off x="0" y="0"/>
+                      <a:ext cx="2601260" cy="1623922"/>
+                    </a:xfrm>
+                    <a:prstGeom prst="rect">
+                      <a:avLst/>
+                    </a:prstGeom>
+                    <a:noFill/>
+                    <a:ln>
+                      <a:noFill/>
+                    </a:ln>
+                  </pic:spPr>
+                </pic:pic>
+              </a:graphicData>
+            </a:graphic>
+          </wp:inline>
+        </w:drawing>
+      </w:r>
+      <w:r>
+        <w:rPr>
+          <w:b/>
+          <w:bCs/>
+          <w:color w:val="2E5396"/>
+          <w:sz w:val="32"/>
+          <w:szCs w:val="32"/>
+        </w:rPr>
+        <w:t xml:space="preserve"> </w:t>
+      </w:r>
+      <w:r>
+        <w:rPr>
+          <w:b/>
+          <w:bCs/>
+          <w:noProof/>
+          <w:color w:val="2E5396"/>
+          <w:sz w:val="32"/>
+          <w:szCs w:val="32"/>
+        </w:rPr>
+        <w:drawing>
+          <wp:inline distT="0" distB="0" distL="0" distR="0" wp14:anchorId="44E335E1" wp14:editId="022284B1">
+            <wp:extent cx="2673350" cy="1620367"/>
+            <wp:effectExtent l="0" t="0" r="0" b="0"/>
+            <wp:docPr id="1759909250" name="Obrázek 2"/>
+            <wp:cNvGraphicFramePr>
+              <a:graphicFrameLocks xmlns:a="http://schemas.openxmlformats.org/drawingml/2006/main" noChangeAspect="1"/>
+            </wp:cNvGraphicFramePr>
+            <a:graphic xmlns:a="http://schemas.openxmlformats.org/drawingml/2006/main">
+              <a:graphicData uri="http://schemas.openxmlformats.org/drawingml/2006/picture">
+                <pic:pic xmlns:pic="http://schemas.openxmlformats.org/drawingml/2006/picture">
+                  <pic:nvPicPr>
+                    <pic:cNvPr id="0" name="Picture 2"/>
+                    <pic:cNvPicPr>
+                      <a:picLocks noChangeAspect="1" noChangeArrowheads="1"/>
+                    </pic:cNvPicPr>
+                  </pic:nvPicPr>
+                  <pic:blipFill>
+                    <a:blip r:embed="rId9" cstate="print">
+                      <a:extLst>
+                        <a:ext uri="{28A0092B-C50C-407E-A947-70E740481C1C}">
+                          <a14:useLocalDpi xmlns:a14="http://schemas.microsoft.com/office/drawing/2010/main" val="0"/>
+                        </a:ext>
+                      </a:extLst>
+                    </a:blip>
+                    <a:srcRect/>
+                    <a:stretch>
+                      <a:fillRect/>
+                    </a:stretch>
+                  </pic:blipFill>
+                  <pic:spPr bwMode="auto">
+                    <a:xfrm>
+                      <a:off x="0" y="0"/>
+                      <a:ext cx="2710885" cy="1643118"/>
+                    </a:xfrm>
+                    <a:prstGeom prst="rect">
+                      <a:avLst/>
+                    </a:prstGeom>
+                    <a:noFill/>
+                    <a:ln>
+                      <a:noFill/>
+                    </a:ln>
+                  </pic:spPr>
+                </pic:pic>
+              </a:graphicData>
+            </a:graphic>
+          </wp:inline>
+        </w:drawing>
+      </w:r>
+    </w:p>
+    <w:p>
+      <w:pPr>
+        <w:rPr>
+          <w:b/>
+          <w:bCs/>
+          <w:color w:val="2E5396"/>
+          <w:sz w:val="32"/>
+          <w:szCs w:val="32"/>
+        </w:rPr>
+      </w:pPr>
+    </w:p>
+    <w:p>
+      <w:pPr>
+        <w:rPr>
+          <w:b/>
+          <w:bCs/>
+          <w:color w:val="2E5396"/>
+          <w:sz w:val="32"/>
+          <w:szCs w:val="32"/>
+        </w:rPr>
+      </w:pPr>
+      <w:r>
+        <w:rPr>
+          <w:b/>
+          <w:bCs/>
+          <w:noProof/>
+          <w:color w:val="2E5396"/>
+          <w:sz w:val="32"/>
+          <w:szCs w:val="32"/>
+        </w:rPr>
+        <w:drawing>
+          <wp:inline distT="0" distB="0" distL="0" distR="0" wp14:anchorId="773730B7" wp14:editId="08DDAE82">
+            <wp:extent cx="2590738" cy="1543050"/>
+            <wp:effectExtent l="0" t="0" r="635" b="0"/>
+            <wp:docPr id="1240776969" name="Obrázek 3"/>
+            <wp:cNvGraphicFramePr>
+              <a:graphicFrameLocks xmlns:a="http://schemas.openxmlformats.org/drawingml/2006/main" noChangeAspect="1"/>
+            </wp:cNvGraphicFramePr>
+            <a:graphic xmlns:a="http://schemas.openxmlformats.org/drawingml/2006/main">
+              <a:graphicData uri="http://schemas.openxmlformats.org/drawingml/2006/picture">
+                <pic:pic xmlns:pic="http://schemas.openxmlformats.org/drawingml/2006/picture">
+                  <pic:nvPicPr>
+                    <pic:cNvPr id="0" name="Picture 3"/>
+                    <pic:cNvPicPr>
+                      <a:picLocks noChangeAspect="1" noChangeArrowheads="1"/>
+                    </pic:cNvPicPr>
+                  </pic:nvPicPr>
+                  <pic:blipFill>
+                    <a:blip r:embed="rId10" cstate="print">
+                      <a:extLst>
+                        <a:ext uri="{28A0092B-C50C-407E-A947-70E740481C1C}">
+                          <a14:useLocalDpi xmlns:a14="http://schemas.microsoft.com/office/drawing/2010/main" val="0"/>
+                        </a:ext>
+                      </a:extLst>
+                    </a:blip>
+                    <a:srcRect/>
+                    <a:stretch>
+                      <a:fillRect/>
+                    </a:stretch>
+                  </pic:blipFill>
+                  <pic:spPr bwMode="auto">
+                    <a:xfrm>
+                      <a:off x="0" y="0"/>
+                      <a:ext cx="2608715" cy="1553757"/>
+                    </a:xfrm>
+                    <a:prstGeom prst="rect">
+                      <a:avLst/>
+                    </a:prstGeom>
+                    <a:noFill/>
+                    <a:ln>
+                      <a:noFill/>
+                    </a:ln>
+                  </pic:spPr>
+                </pic:pic>
+              </a:graphicData>
+            </a:graphic>
+          </wp:inline>
+        </w:drawing>
+      </w:r>
+      <w:r>
+        <w:rPr>
+          <w:b/>
+          <w:bCs/>
+          <w:color w:val="2E5396"/>
+          <w:sz w:val="32"/>
+          <w:szCs w:val="32"/>
+        </w:rPr>
+        <w:t xml:space="preserve"> </w:t>
+      </w:r>
+      <w:r>
+        <w:rPr>
+          <w:b/>
+          <w:bCs/>
+          <w:noProof/>
+          <w:color w:val="2E5396"/>
+          <w:sz w:val="32"/>
+          <w:szCs w:val="32"/>
+        </w:rPr>
+        <w:drawing>
+          <wp:inline distT="0" distB="0" distL="0" distR="0" wp14:anchorId="2AB1998A" wp14:editId="5D613BB6">
+            <wp:extent cx="3127214" cy="1536700"/>
+            <wp:effectExtent l="0" t="0" r="0" b="6350"/>
+            <wp:docPr id="2137306068" name="Obrázek 4"/>
+            <wp:cNvGraphicFramePr>
+              <a:graphicFrameLocks xmlns:a="http://schemas.openxmlformats.org/drawingml/2006/main" noChangeAspect="1"/>
+            </wp:cNvGraphicFramePr>
+            <a:graphic xmlns:a="http://schemas.openxmlformats.org/drawingml/2006/main">
+              <a:graphicData uri="http://schemas.openxmlformats.org/drawingml/2006/picture">
+                <pic:pic xmlns:pic="http://schemas.openxmlformats.org/drawingml/2006/picture">
+                  <pic:nvPicPr>
+                    <pic:cNvPr id="0" name="Picture 4"/>
+                    <pic:cNvPicPr>
+                      <a:picLocks noChangeAspect="1" noChangeArrowheads="1"/>
+                    </pic:cNvPicPr>
+                  </pic:nvPicPr>
+                  <pic:blipFill>
+                    <a:blip r:embed="rId11" cstate="print">
+                      <a:extLst>
+                        <a:ext uri="{28A0092B-C50C-407E-A947-70E740481C1C}">
+                          <a14:useLocalDpi xmlns:a14="http://schemas.microsoft.com/office/drawing/2010/main" val="0"/>
+                        </a:ext>
+                      </a:extLst>
+                    </a:blip>
+                    <a:srcRect/>
+                    <a:stretch>
+                      <a:fillRect/>
+                    </a:stretch>
+                  </pic:blipFill>
+                  <pic:spPr bwMode="auto">
+                    <a:xfrm>
+                      <a:off x="0" y="0"/>
+                      <a:ext cx="3145975" cy="1545919"/>
+                    </a:xfrm>
+                    <a:prstGeom prst="rect">
+                      <a:avLst/>
+                    </a:prstGeom>
+                    <a:noFill/>
+                    <a:ln>
+                      <a:noFill/>
+                    </a:ln>
+                  </pic:spPr>
+                </pic:pic>
+              </a:graphicData>
+            </a:graphic>
+          </wp:inline>
+        </w:drawing>
+      </w:r>
+    </w:p>
+    <w:p>
+      <w:pPr>
+        <w:rPr>
+          <w:b/>
+          <w:bCs/>
+          <w:color w:val="2E5396"/>
+          <w:sz w:val="32"/>
+          <w:szCs w:val="32"/>
+        </w:rPr>
+      </w:pPr>
+    </w:p>
+    <w:p>
+      <w:pPr>
+        <w:rPr>
+          <w:b/>
+          <w:bCs/>
+          <w:color w:val="2E5396"/>
+          <w:sz w:val="32"/>
+          <w:szCs w:val="32"/>
+        </w:rPr>
+      </w:pPr>
+      <w:r>
+        <w:rPr>
+          <w:b/>
+          <w:bCs/>
+          <w:noProof/>
+          <w:color w:val="2E5396"/>
+          <w:sz w:val="32"/>
+          <w:szCs w:val="32"/>
+        </w:rPr>
+        <w:drawing>
+          <wp:inline distT="0" distB="0" distL="0" distR="0" wp14:anchorId="748E1E49" wp14:editId="3D230FE8">
+            <wp:extent cx="2863850" cy="1670123"/>
+            <wp:effectExtent l="0" t="0" r="0" b="6350"/>
+            <wp:docPr id="2092691299" name="Obrázek 5"/>
+            <wp:cNvGraphicFramePr>
+              <a:graphicFrameLocks xmlns:a="http://schemas.openxmlformats.org/drawingml/2006/main" noChangeAspect="1"/>
+            </wp:cNvGraphicFramePr>
+            <a:graphic xmlns:a="http://schemas.openxmlformats.org/drawingml/2006/main">
+              <a:graphicData uri="http://schemas.openxmlformats.org/drawingml/2006/picture">
+                <pic:pic xmlns:pic="http://schemas.openxmlformats.org/drawingml/2006/picture">
+                  <pic:nvPicPr>
+                    <pic:cNvPr id="0" name="Picture 5"/>
+                    <pic:cNvPicPr>
+                      <a:picLocks noChangeAspect="1" noChangeArrowheads="1"/>
+                    </pic:cNvPicPr>
+                  </pic:nvPicPr>
+                  <pic:blipFill>
+                    <a:blip r:embed="rId12" cstate="print">
+                      <a:extLst>
+                        <a:ext uri="{28A0092B-C50C-407E-A947-70E740481C1C}">
+                          <a14:useLocalDpi xmlns:a14="http://schemas.microsoft.com/office/drawing/2010/main" val="0"/>
+                        </a:ext>
+                      </a:extLst>
+                    </a:blip>
+                    <a:srcRect/>
+                    <a:stretch>
+                      <a:fillRect/>
+                    </a:stretch>
+                  </pic:blipFill>
+                  <pic:spPr bwMode="auto">
+                    <a:xfrm>
+                      <a:off x="0" y="0"/>
+                      <a:ext cx="2886354" cy="1683247"/>
+                    </a:xfrm>
+                    <a:prstGeom prst="rect">
+                      <a:avLst/>
+                    </a:prstGeom>
+                    <a:noFill/>
+                    <a:ln>
+                      <a:noFill/>
+                    </a:ln>
+                  </pic:spPr>
+                </pic:pic>
+              </a:graphicData>
+            </a:graphic>
+          </wp:inline>
+        </w:drawing>
+      </w:r>
+      <w:r>
+        <w:rPr>
+          <w:b/>
+          <w:bCs/>
+          <w:color w:val="2E5396"/>
+          <w:sz w:val="32"/>
+          <w:szCs w:val="32"/>
+        </w:rPr>
+        <w:t xml:space="preserve"> </w:t>
+      </w:r>
+      <w:r>
+        <w:rPr>
+          <w:b/>
+          <w:bCs/>
+          <w:noProof/>
+          <w:color w:val="2E5396"/>
+          <w:sz w:val="32"/>
+          <w:szCs w:val="32"/>
+        </w:rPr>
+        <w:drawing>
+          <wp:inline distT="0" distB="0" distL="0" distR="0" wp14:anchorId="0819D775" wp14:editId="30E6CAB3">
+            <wp:extent cx="2876550" cy="1672029"/>
+            <wp:effectExtent l="0" t="0" r="0" b="4445"/>
+            <wp:docPr id="482798078" name="Obrázek 6"/>
+            <wp:cNvGraphicFramePr>
+              <a:graphicFrameLocks xmlns:a="http://schemas.openxmlformats.org/drawingml/2006/main" noChangeAspect="1"/>
+            </wp:cNvGraphicFramePr>
+            <a:graphic xmlns:a="http://schemas.openxmlformats.org/drawingml/2006/main">
+              <a:graphicData uri="http://schemas.openxmlformats.org/drawingml/2006/picture">
+                <pic:pic xmlns:pic="http://schemas.openxmlformats.org/drawingml/2006/picture">
+                  <pic:nvPicPr>
+                    <pic:cNvPr id="0" name="Picture 6"/>
+                    <pic:cNvPicPr>
+                      <a:picLocks noChangeAspect="1" noChangeArrowheads="1"/>
+                    </pic:cNvPicPr>
+                  </pic:nvPicPr>
+                  <pic:blipFill>
+                    <a:blip r:embed="rId13" cstate="print">
+                      <a:extLst>
+                        <a:ext uri="{28A0092B-C50C-407E-A947-70E740481C1C}">
+                          <a14:useLocalDpi xmlns:a14="http://schemas.microsoft.com/office/drawing/2010/main" val="0"/>
+                        </a:ext>
+                      </a:extLst>
+                    </a:blip>
+                    <a:srcRect/>
+                    <a:stretch>
+                      <a:fillRect/>
+                    </a:stretch>
+                  </pic:blipFill>
+                  <pic:spPr bwMode="auto">
+                    <a:xfrm>
+                      <a:off x="0" y="0"/>
+                      <a:ext cx="2918542" cy="1696437"/>
+                    </a:xfrm>
+                    <a:prstGeom prst="rect">
+                      <a:avLst/>
+                    </a:prstGeom>
+                    <a:noFill/>
+                    <a:ln>
+                      <a:noFill/>
+                    </a:ln>
+                  </pic:spPr>
+                </pic:pic>
+              </a:graphicData>
+            </a:graphic>
+          </wp:inline>
+        </w:drawing>
+      </w:r>
+    </w:p>
+    <w:p>
+      <w:pPr>
+        <w:rPr>
+          <w:b/>
+          <w:bCs/>
+          <w:color w:val="2E5396"/>
+          <w:sz w:val="32"/>
+          <w:szCs w:val="32"/>
+        </w:rPr>
+      </w:pPr>
+    </w:p>
+    <w:p>
+      <w:pPr>
+        <w:rPr>
+          <w:b/>
+          <w:bCs/>
+          <w:color w:val="2E5396"/>
+          <w:sz w:val="32"/>
+          <w:szCs w:val="32"/>
+        </w:rPr>
+      </w:pPr>
+    </w:p>
+    <w:p>
+      <w:pPr>
+        <w:rPr>
+          <w:b/>
+          <w:bCs/>
+          <w:color w:val="2E5396"/>
+          <w:sz w:val="32"/>
+          <w:szCs w:val="32"/>
+        </w:rPr>
+      </w:pPr>
+      <w:r>
+        <w:rPr>
+          <w:b/>
+          <w:bCs/>
+          <w:color w:val="2E5396"/>
+          <w:sz w:val="32"/>
+          <w:szCs w:val="32"/>
+        </w:rPr>
+        <w:drawing>
+          <wp:inline distT="0" distB="0" distL="0" distR="0" wp14:anchorId="724618D2" wp14:editId="5C70C748">
+            <wp:extent cx="6645910" cy="2190115"/>
+            <wp:effectExtent l="0" t="0" r="2540" b="635"/>
+            <wp:docPr id="828078816" name="Obrázek 1" descr="Obsah obrázku text, kalendář, číslo, čtverec&#10;&#10;Obsah generovaný pomocí AI může být nesprávný."/>
+            <wp:cNvGraphicFramePr>
+              <a:graphicFrameLocks xmlns:a="http://schemas.openxmlformats.org/drawingml/2006/main" noChangeAspect="1"/>
+            </wp:cNvGraphicFramePr>
+            <a:graphic xmlns:a="http://schemas.openxmlformats.org/drawingml/2006/main">
+              <a:graphicData uri="http://schemas.openxmlformats.org/drawingml/2006/picture">
+                <pic:pic xmlns:pic="http://schemas.openxmlformats.org/drawingml/2006/picture">
+                  <pic:nvPicPr>
+                    <pic:cNvPr id="828078816" name="Obrázek 1" descr="Obsah obrázku text, kalendář, číslo, čtverec&#10;&#10;Obsah generovaný pomocí AI může být nesprávný."/>
+                    <pic:cNvPicPr/>
+                  </pic:nvPicPr>
+                  <pic:blipFill>
+                    <a:blip r:embed="rId14"/>
+                    <a:stretch>
+                      <a:fillRect/>
+                    </a:stretch>
+                  </pic:blipFill>
+                  <pic:spPr>
+                    <a:xfrm>
+                      <a:off x="0" y="0"/>
+                      <a:ext cx="6645910" cy="2190115"/>
+                    </a:xfrm>
+                    <a:prstGeom prst="rect">
+                      <a:avLst/>
+                    </a:prstGeom>
+                  </pic:spPr>
+                </pic:pic>
+              </a:graphicData>
+            </a:graphic>
+          </wp:inline>
+        </w:drawing>
+      </w:r>
+    </w:p>
+    <w:p>
+      <w:pPr>
+        <w:rPr>
+          <w:b/>
+          <w:bCs/>
+          <w:color w:val="2E5396"/>
+          <w:sz w:val="32"/>
+          <w:szCs w:val="32"/>
+        </w:rPr>
+      </w:pPr>
+      <w:r>
+        <w:rPr>
+          <w:b/>
+          <w:bCs/>
+          <w:color w:val="2E5396"/>
+          <w:sz w:val="32"/>
+          <w:szCs w:val="32"/>
+        </w:rPr>
+        <w:br w:type="page"/>
+      </w:r>
+    </w:p>
+    <w:p>
       <w:pPr>
         <w:pStyle w:val="Nadpis1"/>
       </w:pPr>
       <w:r>
+        <w:lastRenderedPageBreak/>
         <w:t>Odborné zdůvodnění hodnoticích kritérií</w:t>
       </w:r>
     </w:p>
@@ -1238,33 +1828,10 @@
     </w:p>
     <w:p>
       <w:r>
-        <w:lastRenderedPageBreak/>
         <w:t>Toto se sice vztahuje na zpoždění přivolání týmu, nikoliv na rychlost práce samotného týmu – ale logika je stejná: každá minuta je důležitá. Tým, který zvládne stopu rychleji, dává pohlešované osobě více času. V případě pohlešovaného s medikamenty, hypotermie v noci nebo sebevražedných úmyslů – vše situace, které Satora i Granicz dokumentují – tento čas rozhoduje doslova o životě.</w:t>
       </w:r>
     </w:p>
-    <w:p>
-      <w:pPr>
-        <w:pStyle w:val="Nadpis3"/>
-      </w:pPr>
-      <w:r>
-        <w:t>Přímá odpověɱ na Satorovu kritiku</w:t>
-      </w:r>
-    </w:p>
-    <w:p>
-      <w:r>
-        <w:t>Satora ve své knize píše explicitně: „Mantrailing není sport, tady není potřeba porovnávat se mezi sebou navzájem. Kritérium je jenom jedno – co nejrychlejší nalezení hledané osoby a to bez jakýchkoliv dalších podmínek.“ Tato námitka je legitimní. Zapřeme-li ji, zbytek pravidel ztratí půdu pod nohama. Proto ji musíme řešit přímo.</w:t>
-      </w:r>
-    </w:p>
-    <w:p>
-      <w:r>
-        <w:t>Satorova kritika směřuje proti závodům, kde je rychlost jediným nebo dominantním kritériem – kde tým, který dorazil nejdříve, vyhrál, bez ohledu na to, jak pes pracoval. V takovém formátu má Satora naprostou pravdu: odměňujeme sprint, ne mantrailing. Tato pravidla však rychlost neměří jako sportovní výkon. Rychlost je zde podmineránná prací psa: vypočítává se výhradně z délky trasy které dosahl tým s uznanými kontrolními body. Tým bez uznaných kontrolních bodů – tedy tým, kde psovod nemůže prokázat, že pes průběžně pracoval – nezíská za rychlost nic. Rychlost je tu výsledkem kvalitní práce, ne její náhradou.</w:t>
-      </w:r>
-    </w:p>
-    <w:p>
-      <w:pPr>
-        <w:pStyle w:val="Nadpis3"/>
-      </w:pPr>
-    </w:p>
+    <w:p/>
     <w:p>
       <w:r>
         <w:t>Rychlost práce je v těchto pravidlech hodnocena jako součást širšího systému – nikoli jako jediné nebo dominantní kritérium. Tým, který jde rychle, ale nepracuje přesně a nečte psa, celkově prohraje s týmem, který jde pomaleji, ale odvede kvalitní práci. To je zásadní rozdíl oproti soutěžím, kde je čas jediným kritériem – a které tak mohou odměňovat rychlou, nekvalitní práci. Rychlost je zde odměňována pouze tehdy, je-li podložena zvládnutou částí stopy a uznanými kontrolními body – tedy skutečnou prací týmu.</w:t>
@@ -1337,6 +1904,11 @@
         <w:t>rychlost na úkor kvality – maximální váha tohoto kritéria je srovnatelná s ostatními kritérii a tým, který pracuje rychle ale nepracuje přesně, v celkovém skóre neprospěje.</w:t>
       </w:r>
     </w:p>
+    <w:p>
+      <w:pPr>
+        <w:ind w:left="720"/>
+      </w:pPr>
+    </w:p>
     <w:p/>
     <w:p/>
     <w:p>
@@ -1344,6 +1916,7 @@
         <w:pStyle w:val="Nadpis2"/>
       </w:pPr>
       <w:r>
+        <w:lastRenderedPageBreak/>
         <w:t>Kritérium 3: Přesnost práce psa</w:t>
       </w:r>
     </w:p>
@@ -1376,15 +1949,7 @@
           <w:i/>
           <w:iCs/>
         </w:rPr>
-        <w:t xml:space="preserve">„Za ideálních podmínek by tedy mohly tyto pachové částice skutečně dopadnout přesně tam, kde hledaná osoba prošla. Většinou jsou ale vítrem odáněny na místa, kde se zachytí na přirozených překážkách. To vysvětluje někdy až nepochopitelný </w:t>
-      </w:r>
-      <w:r>
-        <w:rPr>
-          <w:i/>
-          <w:iCs/>
-        </w:rPr>
-        <w:lastRenderedPageBreak/>
-        <w:t>pohyb psa, který se může pohybovat i několik desítek metrů od skutečné trasy, kudy osoba šla.“</w:t>
+        <w:t>„Za ideálních podmínek by tedy mohly tyto pachové částice skutečně dopadnout přesně tam, kde hledaná osoba prošla. Většinou jsou ale vítrem odáněny na místa, kde se zachytí na přirozených překážkách. To vysvětluje někdy až nepochopitelný pohyb psa, který se může pohybovat i několik desítek metrů od skutečné trasy, kudy osoba šla.“</w:t>
       </w:r>
     </w:p>
     <w:p>
@@ -1520,6 +2085,7 @@
           <w:i/>
           <w:iCs/>
         </w:rPr>
+        <w:lastRenderedPageBreak/>
         <w:t>„GPS tracking is also a useful aid, giving you instant warning if you plan to lead your dog back to the wrong place. [...] On more than one occasion during our training sessions, a dog handler has noticed that his dog is no longer following the trail of the person hiding, so he leads him back to where he thinks they were. But that point was up to ten meters further away than the actual trail. In such cases, the dog may be lucky enough to ‘air scent’ the trail [...] but it may not be able to do so and the search may end in a dead end because the dog handler’s mind map was incorrect.“</w:t>
       </w:r>
     </w:p>
@@ -1566,7 +2132,6 @@
           <w:b/>
           <w:bCs/>
         </w:rPr>
-        <w:lastRenderedPageBreak/>
         <w:t xml:space="preserve">Nesankcionuje </w:t>
       </w:r>
       <w:r>
@@ -1715,7 +2280,15 @@
           <w:i/>
           <w:iCs/>
         </w:rPr>
-        <w:t>„During our deployments, it’s vital to constantly update and evaluate the mental map we keep in our heads. Exactly what route we’ve taken so far, where we’ve experienced unusual conditions. Where our dog has shown behavioral changes, how far he has confidently followed the trail and where is the point where we are no longer confident in our four-legged companion’s work. [...] The mind-map allows you to make adjustments on the go and provides useful information for the head of the operation during the post-evaluations of the tracking.“</w:t>
+        <w:t xml:space="preserve">„During our deployments, it’s vital to constantly update and evaluate the mental map we keep in our heads. Exactly what route we’ve taken so far, where we’ve experienced unusual conditions. Where our dog has shown behavioral changes, how far he has confidently followed the trail and where is the point where we are no </w:t>
+      </w:r>
+      <w:r>
+        <w:rPr>
+          <w:i/>
+          <w:iCs/>
+        </w:rPr>
+        <w:lastRenderedPageBreak/>
+        <w:t>longer confident in our four-legged companion’s work. [...] The mind-map allows you to make adjustments on the go and provides useful information for the head of the operation during the post-evaluations of the tracking.“</w:t>
       </w:r>
     </w:p>
     <w:p>
@@ -1745,15 +2318,7 @@
           <w:i/>
           <w:iCs/>
         </w:rPr>
-        <w:t xml:space="preserve">„Also typical of these two applications is the possibility for the dog handler to ask the flanker to place so-called markers on the map. These points are placed where the dog is moving along the track without stopping, but the handler notices a change in the dog’s behavior. Sometimes a dog may not stop at a critical point for some reason, but its reaction may suggest that if the tracking fails, it is worth returning to </w:t>
-      </w:r>
-      <w:r>
-        <w:rPr>
-          <w:i/>
-          <w:iCs/>
-        </w:rPr>
-        <w:lastRenderedPageBreak/>
-        <w:t>that point and scanning the surrounding area with a mantrailer or an air scent dog. We have already found missing persons in this way.“</w:t>
+        <w:t>„Also typical of these two applications is the possibility for the dog handler to ask the flanker to place so-called markers on the map. These points are placed where the dog is moving along the track without stopping, but the handler notices a change in the dog’s behavior. Sometimes a dog may not stop at a critical point for some reason, but its reaction may suggest that if the tracking fails, it is worth returning to that point and scanning the surrounding area with a mantrailer or an air scent dog. We have already found missing persons in this way.“</w:t>
       </w:r>
     </w:p>
     <w:p>
@@ -2628,6 +3193,7 @@
   <w:style w:type="character" w:default="1" w:styleId="Standardnpsmoodstavce">
     <w:name w:val="Default Paragraph Font"/>
     <w:uiPriority w:val="1"/>
+    <w:semiHidden/>
     <w:unhideWhenUsed/>
   </w:style>
   <w:style w:type="table" w:default="1" w:styleId="Normlntabulka">

</xml_diff>

<commit_message>
Vylepšení bodování a přidání nových GPX souborů
Byl zásadně přepracován bodovací systém pro mantrailingové traily – změna bodování za rychlost, snížení maximálních bodů v kategoriích, zpřesnění pravidel a popisků, vylepšení lokalizace a prezentace výsledků v grafech i tabulkách. Opraveno načítání a ukládání údajů v GPX reportech, včetně waypointů a šířky stopy. Přidán nový GPX soubor s detailními trasami a metadaty. Celkově změny vedou k přesnějšímu, spravedlivějšímu a lépe lokalizovanému bodování a prezentaci výsledků.
</commit_message>
<xml_diff>
--- a/K9TrailsAnalyzer/Resources/Pravidla_zavodu.docx
+++ b/K9TrailsAnalyzer/Resources/Pravidla_zavodu.docx
@@ -151,10 +151,22 @@
           <w:b/>
           <w:bCs/>
         </w:rPr>
-        <w:t>Klíčovým principem</w:t>
-      </w:r>
-      <w:r>
-        <w:t xml:space="preserve">  je, že </w:t>
+        <w:t xml:space="preserve">Klíčovým </w:t>
+      </w:r>
+      <w:proofErr w:type="gramStart"/>
+      <w:r>
+        <w:rPr>
+          <w:b/>
+          <w:bCs/>
+        </w:rPr>
+        <w:t>principem</w:t>
+      </w:r>
+      <w:r>
+        <w:t xml:space="preserve">  je</w:t>
+      </w:r>
+      <w:proofErr w:type="gramEnd"/>
+      <w:r>
+        <w:t xml:space="preserve">, že </w:t>
       </w:r>
       <w:r>
         <w:rPr>
@@ -326,34 +338,88 @@
           <w:b/>
           <w:bCs/>
         </w:rPr>
-        <w:t>2. Rychlost práce</w:t>
-      </w:r>
-      <w:r>
-        <w:t xml:space="preserve"> </w:t>
-      </w:r>
-    </w:p>
-    <w:p>
+        <w:t>2.</w:t>
+      </w:r>
       <w:r>
         <w:rPr>
           <w:b/>
           <w:bCs/>
         </w:rPr>
-        <w:t xml:space="preserve">3. Přesnost práce </w:t>
-      </w:r>
-      <w:r>
-        <w:t xml:space="preserve"> </w:t>
-      </w:r>
-    </w:p>
-    <w:p>
+        <w:t xml:space="preserve"> </w:t>
+      </w:r>
       <w:r>
         <w:rPr>
           <w:b/>
           <w:bCs/>
         </w:rPr>
-        <w:t>4. Schopnost psovoda číst svého psa</w:t>
-      </w:r>
-      <w:r>
-        <w:t xml:space="preserve"> </w:t>
+        <w:t>Schopnost psovoda číst svého psa</w:t>
+      </w:r>
+      <w:r>
+        <w:rPr>
+          <w:b/>
+          <w:bCs/>
+        </w:rPr>
+        <w:t xml:space="preserve"> </w:t>
+      </w:r>
+    </w:p>
+    <w:p>
+      <w:r>
+        <w:rPr>
+          <w:b/>
+          <w:bCs/>
+        </w:rPr>
+        <w:t xml:space="preserve">3. Přesnost práce </w:t>
+      </w:r>
+      <w:r>
+        <w:t xml:space="preserve"> </w:t>
+      </w:r>
+    </w:p>
+    <w:p>
+      <w:r>
+        <w:rPr>
+          <w:b/>
+          <w:bCs/>
+        </w:rPr>
+        <w:t xml:space="preserve">4. </w:t>
+      </w:r>
+      <w:r>
+        <w:rPr>
+          <w:b/>
+          <w:bCs/>
+        </w:rPr>
+        <w:t>Rychlost práce</w:t>
+      </w:r>
+      <w:r>
+        <w:t xml:space="preserve"> </w:t>
+      </w:r>
+    </w:p>
+    <w:p>
+      <w:pPr>
+        <w:rPr>
+          <w:b/>
+          <w:bCs/>
+        </w:rPr>
+      </w:pPr>
+      <w:r>
+        <w:rPr>
+          <w:b/>
+          <w:bCs/>
+        </w:rPr>
+        <w:t>5</w:t>
+      </w:r>
+      <w:r>
+        <w:rPr>
+          <w:b/>
+          <w:bCs/>
+        </w:rPr>
+        <w:t xml:space="preserve">. </w:t>
+      </w:r>
+      <w:r>
+        <w:rPr>
+          <w:b/>
+          <w:bCs/>
+        </w:rPr>
+        <w:t>Rychlé nalezení stopy</w:t>
       </w:r>
     </w:p>
     <w:p>
@@ -497,7 +563,6 @@
     <w:p/>
     <w:p>
       <w:r>
-        <w:lastRenderedPageBreak/>
         <w:t xml:space="preserve">Všechny trasy by měly být kladené ideálně po větru nebo kolmo na něj. Případné předměty slouží pouze jako kontrolní body pro psovoda (může u nich nahlásit kontrolní bod). </w:t>
       </w:r>
     </w:p>
@@ -515,37 +580,487 @@
       </w:r>
     </w:p>
     <w:p/>
+    <w:tbl>
+      <w:tblPr>
+        <w:tblStyle w:val="Mkatabulky"/>
+        <w:tblW w:w="0" w:type="auto"/>
+        <w:tblLook w:val="04A0" w:firstRow="1" w:lastRow="0" w:firstColumn="1" w:lastColumn="0" w:noHBand="0" w:noVBand="1"/>
+      </w:tblPr>
+      <w:tblGrid>
+        <w:gridCol w:w="3681"/>
+        <w:gridCol w:w="4819"/>
+      </w:tblGrid>
+      <w:tr>
+        <w:tc>
+          <w:tcPr>
+            <w:tcW w:w="3681" w:type="dxa"/>
+          </w:tcPr>
+          <w:p>
+            <w:pPr>
+              <w:rPr>
+                <w:b/>
+                <w:bCs/>
+              </w:rPr>
+            </w:pPr>
+            <w:r>
+              <w:rPr>
+                <w:b/>
+                <w:bCs/>
+              </w:rPr>
+              <w:t>Kritérium</w:t>
+            </w:r>
+          </w:p>
+        </w:tc>
+        <w:tc>
+          <w:tcPr>
+            <w:tcW w:w="4819" w:type="dxa"/>
+          </w:tcPr>
+          <w:p>
+            <w:pPr>
+              <w:rPr>
+                <w:b/>
+                <w:bCs/>
+              </w:rPr>
+            </w:pPr>
+            <w:r>
+              <w:rPr>
+                <w:b/>
+                <w:bCs/>
+              </w:rPr>
+              <w:t>Max</w:t>
+            </w:r>
+            <w:r>
+              <w:rPr>
+                <w:b/>
+                <w:bCs/>
+              </w:rPr>
+              <w:t>.</w:t>
+            </w:r>
+            <w:r>
+              <w:rPr>
+                <w:b/>
+                <w:bCs/>
+              </w:rPr>
+              <w:t xml:space="preserve"> počet bodů (návrh – možno měnit)</w:t>
+            </w:r>
+          </w:p>
+        </w:tc>
+      </w:tr>
+      <w:tr>
+        <w:tc>
+          <w:tcPr>
+            <w:tcW w:w="3681" w:type="dxa"/>
+          </w:tcPr>
+          <w:p>
+            <w:r>
+              <w:t>Nalezení osoby</w:t>
+            </w:r>
+          </w:p>
+        </w:tc>
+        <w:tc>
+          <w:tcPr>
+            <w:tcW w:w="4819" w:type="dxa"/>
+          </w:tcPr>
+          <w:p>
+            <w:r>
+              <w:t xml:space="preserve"> </w:t>
+            </w:r>
+            <w:r>
+              <w:t>5</w:t>
+            </w:r>
+            <w:r>
+              <w:t>0</w:t>
+            </w:r>
+          </w:p>
+        </w:tc>
+      </w:tr>
+      <w:tr>
+        <w:tc>
+          <w:tcPr>
+            <w:tcW w:w="3681" w:type="dxa"/>
+          </w:tcPr>
+          <w:p>
+            <w:r>
+              <w:t>Schopnost p</w:t>
+            </w:r>
+            <w:r>
+              <w:t>sovoda číst psa</w:t>
+            </w:r>
+          </w:p>
+        </w:tc>
+        <w:tc>
+          <w:tcPr>
+            <w:tcW w:w="4819" w:type="dxa"/>
+          </w:tcPr>
+          <w:p>
+            <w:r>
+              <w:t xml:space="preserve"> </w:t>
+            </w:r>
+            <w:r>
+              <w:t>20</w:t>
+            </w:r>
+          </w:p>
+        </w:tc>
+      </w:tr>
+      <w:tr>
+        <w:tc>
+          <w:tcPr>
+            <w:tcW w:w="3681" w:type="dxa"/>
+          </w:tcPr>
+          <w:p>
+            <w:r>
+              <w:t>P</w:t>
+            </w:r>
+            <w:r>
+              <w:t>řesnost práce psa</w:t>
+            </w:r>
+          </w:p>
+        </w:tc>
+        <w:tc>
+          <w:tcPr>
+            <w:tcW w:w="4819" w:type="dxa"/>
+          </w:tcPr>
+          <w:p>
+            <w:r>
+              <w:t xml:space="preserve"> </w:t>
+            </w:r>
+            <w:r>
+              <w:t>15</w:t>
+            </w:r>
+          </w:p>
+        </w:tc>
+      </w:tr>
+      <w:tr>
+        <w:tc>
+          <w:tcPr>
+            <w:tcW w:w="3681" w:type="dxa"/>
+          </w:tcPr>
+          <w:p>
+            <w:r>
+              <w:t>Tempo postupu týmu</w:t>
+            </w:r>
+          </w:p>
+        </w:tc>
+        <w:tc>
+          <w:tcPr>
+            <w:tcW w:w="4819" w:type="dxa"/>
+          </w:tcPr>
+          <w:p>
+            <w:r>
+              <w:t xml:space="preserve"> </w:t>
+            </w:r>
+            <w:r>
+              <w:t>10</w:t>
+            </w:r>
+          </w:p>
+        </w:tc>
+      </w:tr>
+      <w:tr>
+        <w:tc>
+          <w:tcPr>
+            <w:tcW w:w="3681" w:type="dxa"/>
+          </w:tcPr>
+          <w:p>
+            <w:r>
+              <w:t>Rychlé nalezení stopy</w:t>
+            </w:r>
+          </w:p>
+        </w:tc>
+        <w:tc>
+          <w:tcPr>
+            <w:tcW w:w="4819" w:type="dxa"/>
+          </w:tcPr>
+          <w:p>
+            <w:r>
+              <w:t xml:space="preserve">    </w:t>
+            </w:r>
+            <w:r>
+              <w:t>5</w:t>
+            </w:r>
+          </w:p>
+        </w:tc>
+      </w:tr>
+      <w:tr>
+        <w:tc>
+          <w:tcPr>
+            <w:tcW w:w="3681" w:type="dxa"/>
+          </w:tcPr>
+          <w:p>
+            <w:pPr>
+              <w:rPr>
+                <w:b/>
+                <w:bCs/>
+              </w:rPr>
+            </w:pPr>
+            <w:r>
+              <w:rPr>
+                <w:b/>
+                <w:bCs/>
+              </w:rPr>
+              <w:t>Celkem</w:t>
+            </w:r>
+          </w:p>
+        </w:tc>
+        <w:tc>
+          <w:tcPr>
+            <w:tcW w:w="4819" w:type="dxa"/>
+          </w:tcPr>
+          <w:p>
+            <w:pPr>
+              <w:rPr>
+                <w:b/>
+                <w:bCs/>
+              </w:rPr>
+            </w:pPr>
+            <w:r>
+              <w:rPr>
+                <w:b/>
+                <w:bCs/>
+              </w:rPr>
+              <w:t>100</w:t>
+            </w:r>
+          </w:p>
+        </w:tc>
+      </w:tr>
+    </w:tbl>
+    <w:p>
+      <w:pPr>
+        <w:rPr>
+          <w:b/>
+          <w:bCs/>
+        </w:rPr>
+      </w:pPr>
+    </w:p>
     <w:p>
       <w:pPr>
         <w:pStyle w:val="Nadpis2"/>
       </w:pPr>
       <w:r>
-        <w:t>1. Nález osoby</w:t>
-      </w:r>
-    </w:p>
-    <w:p>
-      <w:r>
-        <w:t>0 nebo 100 bodů</w:t>
-      </w:r>
-    </w:p>
-    <w:p/>
+        <w:t>1. N</w:t>
+      </w:r>
+      <w:r>
+        <w:t>a</w:t>
+      </w:r>
+      <w:r>
+        <w:t>lez</w:t>
+      </w:r>
+      <w:r>
+        <w:t>ení</w:t>
+      </w:r>
+      <w:r>
+        <w:t xml:space="preserve"> osoby</w:t>
+      </w:r>
+    </w:p>
+    <w:p>
+      <w:r>
+        <w:t xml:space="preserve">Nalezení osoby je bez </w:t>
+      </w:r>
+      <w:proofErr w:type="gramStart"/>
+      <w:r>
+        <w:t>diskuze</w:t>
+      </w:r>
+      <w:proofErr w:type="gramEnd"/>
+      <w:r>
+        <w:t xml:space="preserve"> hlavním cílem stopování a je proto ohodnoceno největším počtem bodů.</w:t>
+      </w:r>
+    </w:p>
     <w:p>
       <w:pPr>
         <w:pStyle w:val="Nadpis2"/>
       </w:pPr>
       <w:r>
-        <w:t>2. Rychlost práce</w:t>
-      </w:r>
-    </w:p>
-    <w:p>
-      <w:r>
-        <w:t>+20 bodů za každý km/h (tedy 100 bodů při rychlosti 5 km/h). Rychlost se počítá z</w:t>
-      </w:r>
-      <w:r>
-        <w:t>e skutečné</w:t>
-      </w:r>
-      <w:r>
-        <w:t xml:space="preserve"> délky trasy kladeče mezi startem a posledním uznaným kontrolním bodem (nebo nálezem osoby), děleno příslušným časem měřeno od startu týmu. Výsledek se násobí váhou podle úspěšně zvládnuté části trasy – např. pokud je poslední kontrolní bod v polovině trasy, váha = 0,5, tedy 10 bodů za každý km/h.</w:t>
+        <w:t>2</w:t>
+      </w:r>
+      <w:r>
+        <w:t>. Schopnost psovoda číst psa – kontrolní body</w:t>
+      </w:r>
+    </w:p>
+    <w:p>
+      <w:r>
+        <w:t xml:space="preserve">Schopnost psovoda číst psa je jedna z nejdůležitějších dovedností při praktickém stopování. Je proto ohodnocena vysokým počtem bodů. K hodnocení se používají </w:t>
+      </w:r>
+      <w:r>
+        <w:t>„kontrolní body“.</w:t>
+      </w:r>
+    </w:p>
+    <w:p/>
+    <w:p>
+      <w:r>
+        <w:rPr>
+          <w:b/>
+          <w:bCs/>
+        </w:rPr>
+        <w:t xml:space="preserve">Co je kontrolní bod: </w:t>
+      </w:r>
+      <w:r>
+        <w:t>Psovod může kdykoliv během výkonu nahlásit „kontrolní bod“ – tedy místo, kde je přesvědčen, že pes správně sleduje stopu. Rozhodčí kontrolní bod uzná pouze tehdy, pokud cílová osoba ještě není na dohled.</w:t>
+      </w:r>
+    </w:p>
+    <w:p/>
+    <w:p>
+      <w:r>
+        <w:rPr>
+          <w:b/>
+          <w:bCs/>
+        </w:rPr>
+        <w:t xml:space="preserve">Jak nahlásit: </w:t>
+      </w:r>
+      <w:r>
+        <w:t>Kdykoli jsi přesvědčen, že pes právě pracuje správně, řekni rozhodčímu:</w:t>
+      </w:r>
+      <w:r>
+        <w:rPr>
+          <w:b/>
+          <w:bCs/>
+        </w:rPr>
+        <w:t xml:space="preserve"> „Kontrolní bod.“</w:t>
+      </w:r>
+      <w:r>
+        <w:t xml:space="preserve"> To je vše – matematiku hodnocení zajišťuje aplikace automaticky.</w:t>
+      </w:r>
+    </w:p>
+    <w:p/>
+    <w:p>
+      <w:r>
+        <w:rPr>
+          <w:b/>
+          <w:bCs/>
+        </w:rPr>
+        <w:t>Pravidla uznání:</w:t>
+      </w:r>
+    </w:p>
+    <w:p>
+      <w:pPr>
+        <w:pStyle w:val="Odstavecseseznamem"/>
+        <w:numPr>
+          <w:ilvl w:val="0"/>
+          <w:numId w:val="2"/>
+        </w:numPr>
+      </w:pPr>
+      <w:r>
+        <w:t>Kontrolní bod lze nahlásit kdykoliv během práce na stopě, opakovaně.</w:t>
+      </w:r>
+    </w:p>
+    <w:p>
+      <w:pPr>
+        <w:pStyle w:val="Odstavecseseznamem"/>
+        <w:numPr>
+          <w:ilvl w:val="0"/>
+          <w:numId w:val="2"/>
+        </w:numPr>
+      </w:pPr>
+      <w:r>
+        <w:t>Rozhodčí bod uzná, jen pokud cílová osoba ještě není na dohled.</w:t>
+      </w:r>
+    </w:p>
+    <w:p>
+      <w:pPr>
+        <w:pStyle w:val="Odstavecseseznamem"/>
+        <w:numPr>
+          <w:ilvl w:val="0"/>
+          <w:numId w:val="2"/>
+        </w:numPr>
+      </w:pPr>
+      <w:r>
+        <w:t>Kontrolní bod se zaznamenává i u psovodem nahlášeného předmětu na trase (bez ohledu na to, zda ho pes označil – rozhodující je hlášení psovoda).</w:t>
+      </w:r>
+    </w:p>
+    <w:p>
+      <w:pPr>
+        <w:pStyle w:val="Odstavecseseznamem"/>
+        <w:numPr>
+          <w:ilvl w:val="0"/>
+          <w:numId w:val="2"/>
+        </w:numPr>
+      </w:pPr>
+      <w:r>
+        <w:t>Nález kladeče se jako kontrolní bod nepočítá – hodnotí se samostatně v bodě 1. Samotné dosažení konce trasy tedy nemá vliv na toto hodnocení.</w:t>
+      </w:r>
+    </w:p>
+    <w:p>
+      <w:pPr>
+        <w:pStyle w:val="Odstavecseseznamem"/>
+        <w:numPr>
+          <w:ilvl w:val="0"/>
+          <w:numId w:val="2"/>
+        </w:numPr>
+      </w:pPr>
+      <w:r>
+        <w:t>Konec práce (místo, kde psovod práci ukončil nebo vypršel časový limit) se jako kontrolní bod počítá jen tehdy, pokud ho psovod výslovně nahlásí a cílová osoba ještě není na dohled.</w:t>
+      </w:r>
+    </w:p>
+    <w:p/>
+    <w:p>
+      <w:r>
+        <w:rPr>
+          <w:b/>
+          <w:bCs/>
+        </w:rPr>
+        <w:t xml:space="preserve">Využití kontrolních bodů pro návrat ke stopě: </w:t>
+      </w:r>
+      <w:r>
+        <w:t>Pokud pes stopu ztratí, může psovod požádat rozhodčího o návrat k poslednímu nahlášenému kontrolnímu bodu. Tuto roli může plnit i pomocník psovoda, pokud jej psovod má.</w:t>
+      </w:r>
+    </w:p>
+    <w:p/>
+    <w:p>
+      <w:r>
+        <w:rPr>
+          <w:b/>
+          <w:bCs/>
+        </w:rPr>
+        <w:t>Jak se kontrolní body hodnotí:</w:t>
+      </w:r>
+    </w:p>
+    <w:p/>
+    <w:p>
+      <w:r>
+        <w:t>Hodnocení odměňuje ty psovody, kteří čtou dobře psa průběžně po celé trase, před těmi, co nahlásí jen jeden nebo dva kontrolní body. Zároveň platí, že přidání dalšího kontrolního bodu nikdy nemůže snížit dosažené skóre (pokud je bod v blízkosti trasy kladeče).</w:t>
+      </w:r>
+    </w:p>
+    <w:p/>
+    <w:p>
+      <w:r>
+        <w:lastRenderedPageBreak/>
+        <w:t>Každý kontrolní bod přispívá do celkového skóre na základě dvou faktorů:</w:t>
+      </w:r>
+    </w:p>
+    <w:p>
+      <w:pPr>
+        <w:pStyle w:val="Odstavecseseznamem"/>
+        <w:numPr>
+          <w:ilvl w:val="0"/>
+          <w:numId w:val="2"/>
+        </w:numPr>
+      </w:pPr>
+      <w:r>
+        <w:rPr>
+          <w:b/>
+          <w:bCs/>
+        </w:rPr>
+        <w:t>Přesnost bodu</w:t>
+      </w:r>
+      <w:r>
+        <w:t xml:space="preserve"> – jak blízko trasy kladeče se tým v okamžiku hlášení nacházel (stejná váhová funkce jako v bodě 3).</w:t>
+      </w:r>
+    </w:p>
+    <w:p>
+      <w:pPr>
+        <w:pStyle w:val="Odstavecseseznamem"/>
+        <w:numPr>
+          <w:ilvl w:val="0"/>
+          <w:numId w:val="2"/>
+        </w:numPr>
+      </w:pPr>
+      <w:r>
+        <w:rPr>
+          <w:b/>
+          <w:bCs/>
+        </w:rPr>
+        <w:t>Délka úseku od předchozího bodu</w:t>
+      </w:r>
+      <w:r>
+        <w:t xml:space="preserve"> – dlouhá mezera (psovod dlouho nic nehlásil – nebyl si jistý, zda je pes na stopě) je penalizována. Přibližně platí že pokud je vzdálenost mezi psovodem hlášenými kontrolními body 50 % délky trasy kladeče, tak tým dostane jen 50 % možných bodů v této „disciplíně“.</w:t>
       </w:r>
     </w:p>
     <w:p/>
@@ -559,7 +1074,51 @@
     </w:p>
     <w:p>
       <w:r>
-        <w:t xml:space="preserve">Maximálně 100 bodů. Hodnotí se váhou </w:t>
+        <w:t xml:space="preserve">Při praktickém stopování nemůže být přesnost práce hodnocena tak přísně jako </w:t>
+      </w:r>
+      <w:r>
+        <w:t>na</w:t>
+      </w:r>
+      <w:r>
+        <w:t xml:space="preserve"> </w:t>
+      </w:r>
+      <w:r>
+        <w:t>sportovních stopách. V</w:t>
+      </w:r>
+      <w:r>
+        <w:t xml:space="preserve"> žádném případě nesmí být tým </w:t>
+      </w:r>
+      <w:r>
+        <w:t>zastaven,</w:t>
+      </w:r>
+      <w:r>
+        <w:t xml:space="preserve"> když se od stopy více odchýlí</w:t>
+      </w:r>
+      <w:r>
+        <w:t xml:space="preserve">. Na druhou stranu přesnější práce je </w:t>
+      </w:r>
+      <w:r>
+        <w:t xml:space="preserve">vždy </w:t>
+      </w:r>
+      <w:r>
+        <w:t>výhodou</w:t>
+      </w:r>
+      <w:r>
+        <w:t xml:space="preserve"> a pes by neměl pracovat jako při plošném</w:t>
+      </w:r>
+      <w:r>
+        <w:t xml:space="preserve"> </w:t>
+      </w:r>
+      <w:r>
+        <w:t>pátrání.</w:t>
+      </w:r>
+    </w:p>
+    <w:p>
+      <w:r>
+        <w:t>Přesnost se h</w:t>
+      </w:r>
+      <w:r>
+        <w:t xml:space="preserve">odnotí váhou </w:t>
       </w:r>
       <w:r>
         <w:rPr>
@@ -569,7 +1128,17 @@
         <w:t>w</w:t>
       </w:r>
       <w:r>
-        <w:t xml:space="preserve"> podle odchylky psa od trasy kladeče. Váha w se mění spojitě podle matematické funkce, která v určitých bodech nabývá těchto hodnot:</w:t>
+        <w:t xml:space="preserve"> podle odchylky psa od trasy kladeče. Váha </w:t>
+      </w:r>
+      <w:r>
+        <w:rPr>
+          <w:i/>
+          <w:iCs/>
+        </w:rPr>
+        <w:t>w</w:t>
+      </w:r>
+      <w:r>
+        <w:t xml:space="preserve"> se mění spojitě podle matematické funkce, která v určitých bodech nabývá těchto hodnot:</w:t>
       </w:r>
     </w:p>
     <w:p/>
@@ -591,9 +1160,9 @@
         <w:tblLook w:val="0000" w:firstRow="0" w:lastRow="0" w:firstColumn="0" w:lastColumn="0" w:noHBand="0" w:noVBand="0"/>
       </w:tblPr>
       <w:tblGrid>
-        <w:gridCol w:w="2654"/>
-        <w:gridCol w:w="2494"/>
-        <w:gridCol w:w="3878"/>
+        <w:gridCol w:w="2203"/>
+        <w:gridCol w:w="2070"/>
+        <w:gridCol w:w="4753"/>
       </w:tblGrid>
       <w:tr>
         <w:tc>
@@ -705,12 +1274,11 @@
             </w:tcMar>
           </w:tcPr>
           <w:p>
+            <w:proofErr w:type="gramStart"/>
             <w:r>
-              <w:t xml:space="preserve">&lt; </w:t>
+              <w:t>&lt; 5</w:t>
             </w:r>
-            <w:r>
-              <w:t>5</w:t>
-            </w:r>
+            <w:proofErr w:type="gramEnd"/>
             <w:r>
               <w:t xml:space="preserve"> m</w:t>
             </w:r>
@@ -780,10 +1348,7 @@
           </w:tcPr>
           <w:p>
             <w:r>
-              <w:t>15</w:t>
-            </w:r>
-            <w:r>
-              <w:t xml:space="preserve"> m</w:t>
+              <w:t>15 m</w:t>
             </w:r>
           </w:p>
         </w:tc>
@@ -851,10 +1416,7 @@
           </w:tcPr>
           <w:p>
             <w:r>
-              <w:t>3</w:t>
-            </w:r>
-            <w:r>
-              <w:t>0 m a více</w:t>
+              <w:t>30 m a více</w:t>
             </w:r>
           </w:p>
         </w:tc>
@@ -898,7 +1460,13 @@
           </w:tcPr>
           <w:p>
             <w:r>
-              <w:t>nepřesné</w:t>
+              <w:t>n</w:t>
+            </w:r>
+            <w:r>
+              <w:t>epřesné</w:t>
+            </w:r>
+            <w:r>
+              <w:t>, ale stále přijatelné</w:t>
             </w:r>
           </w:p>
         </w:tc>
@@ -929,13 +1497,25 @@
         <w:t xml:space="preserve">než malé </w:t>
       </w:r>
       <w:r>
-        <w:t xml:space="preserve">– pes který šel celou dobu 15 m od stopy dostane 50 bodů, ale </w:t>
-      </w:r>
-      <w:r>
-        <w:t>pes,</w:t>
-      </w:r>
-      <w:r>
-        <w:t xml:space="preserve"> který šel půlku trasy perfektně a půlku 30 m od stopy dostane méně než 50 bodů, protože váhová funkce je nelineární.</w:t>
+        <w:t xml:space="preserve">– pes který šel celou dobu 15 m od stopy dostane </w:t>
+      </w:r>
+      <w:r>
+        <w:t>polovinu maximálního počtu</w:t>
+      </w:r>
+      <w:r>
+        <w:t xml:space="preserve"> bod</w:t>
+      </w:r>
+      <w:r>
+        <w:t>ů</w:t>
+      </w:r>
+      <w:r>
+        <w:t xml:space="preserve">, ale pes, který šel půlku trasy perfektně a půlku 30 m od stopy dostane méně než </w:t>
+      </w:r>
+      <w:r>
+        <w:t>polovinu</w:t>
+      </w:r>
+      <w:r>
+        <w:t>, protože váhová funkce je nelineární.</w:t>
       </w:r>
     </w:p>
     <w:p/>
@@ -944,193 +1524,90 @@
         <w:pStyle w:val="Nadpis2"/>
       </w:pPr>
       <w:r>
-        <w:t>4. Schopnost psovoda číst psa – kontrolní body</w:t>
-      </w:r>
-    </w:p>
-    <w:p>
-      <w:r>
-        <w:rPr>
-          <w:b/>
-          <w:bCs/>
-        </w:rPr>
-        <w:t xml:space="preserve">Co je kontrolní bod: </w:t>
-      </w:r>
-      <w:r>
-        <w:t>Psovod může kdykoliv během výkonu nahlásit „kontrolní bod“ – tedy místo, kde je přesvědčen, že pes správně sleduje stopu. Rozhodčí kontrolní bod uzná pouze tehdy, pokud cílová osoba ještě není na dohled.</w:t>
+        <w:t>4</w:t>
+      </w:r>
+      <w:r>
+        <w:t>. Tempo postupu týmu</w:t>
+      </w:r>
+    </w:p>
+    <w:p>
+      <w:r>
+        <w:t xml:space="preserve">Rychlé nalezení pohřešované osoby je důležitým cílem. </w:t>
+      </w:r>
+      <w:r>
+        <w:t xml:space="preserve">Na druhou stranu by snaha o rychlost neměla vést k tomu, že psovod tlačí na psa – to vede velmi často k selhání. Rychlost je tedy </w:t>
+      </w:r>
+      <w:r>
+        <w:t>jen pomocným kritériem s poměrně malou bonifikací.</w:t>
+      </w:r>
+    </w:p>
+    <w:p>
+      <w:r>
+        <w:t>+2 body za každý km/h (tedy 10 bodů při rychlosti 5 km/h). Rychlost se počítá ze skutečné délky trasy kladeče mezi startem a posledním uznaným kontrolním bodem (nebo nálezem osoby), děleno příslušným časem měřeno od startu týmu. Výsledek se násobí váhou podle úspěšně zvládnuté části trasy – např. pokud je poslední kontrolní bod v polovině trasy, váha = 0,5, tedy 1 bod za každý km/h.</w:t>
+      </w:r>
+      <w:r>
+        <w:t xml:space="preserve"> Za rychlost vyšší než 5 km/h již bodové hodnocení neroste</w:t>
+      </w:r>
+      <w:r>
+        <w:t xml:space="preserve"> – tak rych</w:t>
+      </w:r>
+      <w:r>
+        <w:t>lý postup už není žádoucí, zvyšuje riziko selhání týmu.</w:t>
       </w:r>
     </w:p>
     <w:p/>
-    <w:p/>
-    <w:p>
-      <w:r>
-        <w:rPr>
-          <w:b/>
-          <w:bCs/>
-        </w:rPr>
-        <w:t xml:space="preserve">Jak nahlásit: </w:t>
-      </w:r>
-      <w:r>
-        <w:t>Kdykoli jsi přesvědčen, že pes právě pracuje správně, řekni rozhodčímu:</w:t>
-      </w:r>
-      <w:r>
-        <w:rPr>
-          <w:b/>
-          <w:bCs/>
-        </w:rPr>
-        <w:t xml:space="preserve"> „Kontrolní bod.“</w:t>
-      </w:r>
-      <w:r>
-        <w:t xml:space="preserve"> To je vše – matematiku hodnocení zajišťuje aplikace automaticky.</w:t>
-      </w:r>
-    </w:p>
-    <w:p/>
-    <w:p>
-      <w:r>
-        <w:rPr>
-          <w:b/>
-          <w:bCs/>
-        </w:rPr>
-        <w:t>Pravidla uznání:</w:t>
-      </w:r>
-    </w:p>
     <w:p>
       <w:pPr>
-        <w:pStyle w:val="Odstavecseseznamem"/>
-        <w:numPr>
-          <w:ilvl w:val="0"/>
-          <w:numId w:val="2"/>
-        </w:numPr>
+        <w:pStyle w:val="Nadpis2"/>
       </w:pPr>
       <w:r>
-        <w:t>Kontrolní bod lze nahlásit kdykoliv během práce na stopě, opakovaně.</w:t>
-      </w:r>
-    </w:p>
-    <w:p>
-      <w:pPr>
-        <w:pStyle w:val="Odstavecseseznamem"/>
-        <w:numPr>
-          <w:ilvl w:val="0"/>
-          <w:numId w:val="2"/>
-        </w:numPr>
-      </w:pPr>
-      <w:r>
-        <w:t>Rozhodčí bod uzná, jen pokud cílová osoba ještě není na dohled.</w:t>
-      </w:r>
-    </w:p>
-    <w:p>
-      <w:pPr>
-        <w:pStyle w:val="Odstavecseseznamem"/>
-        <w:numPr>
-          <w:ilvl w:val="0"/>
-          <w:numId w:val="2"/>
-        </w:numPr>
-      </w:pPr>
-      <w:r>
-        <w:lastRenderedPageBreak/>
-        <w:t>Kontrolní bod se zaznamenává i u psovodem nahlášeného předmětu na trase (bez ohledu na to, zda ho pes označil – rozhodující je hlášení psovoda).</w:t>
-      </w:r>
-    </w:p>
-    <w:p>
-      <w:pPr>
-        <w:pStyle w:val="Odstavecseseznamem"/>
-        <w:numPr>
-          <w:ilvl w:val="0"/>
-          <w:numId w:val="2"/>
-        </w:numPr>
-      </w:pPr>
-      <w:r>
-        <w:t>Nález kladeče se jako kontrolní bod nepočítá – hodnotí se samostatně v bodě 1. Samotné dosažení konce trasy tedy nemá vliv na toto hodnocení.</w:t>
-      </w:r>
-    </w:p>
-    <w:p>
-      <w:pPr>
-        <w:pStyle w:val="Odstavecseseznamem"/>
-        <w:numPr>
-          <w:ilvl w:val="0"/>
-          <w:numId w:val="2"/>
-        </w:numPr>
-      </w:pPr>
-      <w:r>
-        <w:t>Konec práce (místo, kde psovod práci ukončil nebo vypršel časový limit) se jako kontrolní bod počítá jen tehdy, pokud ho psovod výslovně nahlásí a cílová osoba ještě není na dohled.</w:t>
-      </w:r>
-    </w:p>
-    <w:p/>
-    <w:p>
-      <w:r>
-        <w:rPr>
-          <w:b/>
-          <w:bCs/>
-        </w:rPr>
-        <w:t xml:space="preserve">Využití kontrolních bodů pro návrat ke stopě: </w:t>
-      </w:r>
-      <w:r>
-        <w:t>Pokud pes stopu ztratí, může psovod požádat rozhodčího o návrat k poslednímu nahlášenému kontrolnímu bodu. Tuto roli může plnit i pomocník psovoda, pokud jej psovod má.</w:t>
-      </w:r>
-    </w:p>
-    <w:p/>
-    <w:p>
-      <w:r>
-        <w:rPr>
-          <w:b/>
-          <w:bCs/>
-        </w:rPr>
-        <w:t>Jak se kontrolní body hodnotí:</w:t>
-      </w:r>
-    </w:p>
-    <w:p/>
-    <w:p>
-      <w:r>
-        <w:t>Hodnocení odměňuje ty psovody, kteří čtou dobře psa průběžně po celé trase, před těmi, co nahlásí jen jeden nebo dva kontrolní body. Zároveň platí, že přidání dalšího kontrolního bodu nikdy nemůže snížit dosažené skóre (pokud je bod v blízkosti trasy kladeče).</w:t>
-      </w:r>
-    </w:p>
-    <w:p/>
-    <w:p>
-      <w:r>
-        <w:t>Každý kontrolní bod přispívá do celkového skóre na základě dvou faktorů:</w:t>
-      </w:r>
-    </w:p>
-    <w:p>
-      <w:pPr>
-        <w:pStyle w:val="Odstavecseseznamem"/>
-        <w:numPr>
-          <w:ilvl w:val="0"/>
-          <w:numId w:val="2"/>
-        </w:numPr>
-      </w:pPr>
-      <w:r>
-        <w:rPr>
-          <w:b/>
-          <w:bCs/>
-        </w:rPr>
-        <w:t>Přesnost bodu</w:t>
-      </w:r>
-      <w:r>
-        <w:t xml:space="preserve"> – jak blízko trasy kladeče se tým v okamžiku hlášení nacházel (stejná váhová funkce jako v bodě 3).</w:t>
-      </w:r>
-    </w:p>
-    <w:p>
-      <w:pPr>
-        <w:pStyle w:val="Odstavecseseznamem"/>
-        <w:numPr>
-          <w:ilvl w:val="0"/>
-          <w:numId w:val="2"/>
-        </w:numPr>
-      </w:pPr>
-      <w:r>
-        <w:rPr>
-          <w:b/>
-          <w:bCs/>
-        </w:rPr>
-        <w:t>Délka úseku od předchozího bodu</w:t>
-      </w:r>
-      <w:r>
-        <w:t xml:space="preserve"> – dlouhá mezera (psovod dlouho nic nehlásil – nebyl si jistý, zda je pes na stopě) je penalizována. Přibližně platí že pokud je vzdálenost mezi psovodem hlášenými kontrolními body 50 % délky trasy kladeče, tak tým dostane jen 50 % možných bodů v této „disciplíně“.</w:t>
-      </w:r>
-    </w:p>
-    <w:p/>
-    <w:p>
-      <w:r>
-        <w:t>Maximální počet bodů v této kategorii je 100.</w:t>
+        <w:t>5</w:t>
+      </w:r>
+      <w:r>
+        <w:t xml:space="preserve">. </w:t>
+      </w:r>
+      <w:r>
+        <w:t>Rychl</w:t>
+      </w:r>
+      <w:r>
+        <w:t>é</w:t>
+      </w:r>
+      <w:r>
+        <w:t xml:space="preserve"> </w:t>
+      </w:r>
+      <w:r>
+        <w:t>vyhledání stopy</w:t>
+      </w:r>
+    </w:p>
+    <w:p>
+      <w:r>
+        <w:t>Rychlé nalezení správné stopy dle</w:t>
+      </w:r>
+      <w:r>
+        <w:t xml:space="preserve"> vzorku</w:t>
+      </w:r>
+      <w:r>
+        <w:t xml:space="preserve"> individu</w:t>
+      </w:r>
+      <w:r>
+        <w:t xml:space="preserve">álního pachu </w:t>
+      </w:r>
+      <w:r>
+        <w:t xml:space="preserve">je důležitým výchozím bodem pro úspěšné nalezení pohřešované osoby. Hodnotí </w:t>
+      </w:r>
+      <w:proofErr w:type="gramStart"/>
+      <w:r>
+        <w:t>se</w:t>
+      </w:r>
+      <w:proofErr w:type="gramEnd"/>
+      <w:r>
+        <w:t xml:space="preserve"> </w:t>
+      </w:r>
+      <w:r>
+        <w:t>jak dlouho týmu trvá než</w:t>
+      </w:r>
+      <w:r>
+        <w:t xml:space="preserve"> vyrazí po správné stopě – počítá se prvních 60 metrů stopy. </w:t>
       </w:r>
     </w:p>
     <w:p>
@@ -1191,9 +1668,7 @@
         </w:rPr>
         <w:t xml:space="preserve"> a bodového hodnocení</w:t>
       </w:r>
-    </w:p>
-    <w:p>
-      <w:pPr>
+      <w:r>
         <w:rPr>
           <w:b/>
           <w:bCs/>
@@ -1201,7 +1676,8 @@
           <w:sz w:val="32"/>
           <w:szCs w:val="32"/>
         </w:rPr>
-      </w:pPr>
+        <w:t xml:space="preserve"> </w:t>
+      </w:r>
     </w:p>
     <w:p>
       <w:pPr>
@@ -1213,6 +1689,27 @@
           <w:szCs w:val="32"/>
         </w:rPr>
       </w:pPr>
+    </w:p>
+    <w:p>
+      <w:pPr>
+        <w:rPr>
+          <w:b/>
+          <w:bCs/>
+          <w:color w:val="2E5396"/>
+          <w:sz w:val="32"/>
+          <w:szCs w:val="32"/>
+        </w:rPr>
+      </w:pPr>
+      <w:r>
+        <w:rPr>
+          <w:b/>
+          <w:bCs/>
+          <w:color w:val="2E5396"/>
+          <w:sz w:val="32"/>
+          <w:szCs w:val="32"/>
+        </w:rPr>
+        <w:t xml:space="preserve"> </w:t>
+      </w:r>
       <w:r>
         <w:rPr>
           <w:b/>
@@ -1223,10 +1720,10 @@
           <w:szCs w:val="32"/>
         </w:rPr>
         <w:drawing>
-          <wp:inline distT="0" distB="0" distL="0" distR="0" wp14:anchorId="3F3D564B" wp14:editId="008655DD">
-            <wp:extent cx="2590800" cy="1617392"/>
-            <wp:effectExtent l="0" t="0" r="0" b="1905"/>
-            <wp:docPr id="1329373794" name="Obrázek 1"/>
+          <wp:inline distT="0" distB="0" distL="0" distR="0" wp14:anchorId="60DB0CEA" wp14:editId="0E812264">
+            <wp:extent cx="3082898" cy="2082800"/>
+            <wp:effectExtent l="0" t="0" r="3810" b="0"/>
+            <wp:docPr id="849991639" name="Obrázek 6" descr="Obsah obrázku mapa, text, atlas&#10;&#10;Obsah generovaný pomocí AI může být nesprávný."/>
             <wp:cNvGraphicFramePr>
               <a:graphicFrameLocks xmlns:a="http://schemas.openxmlformats.org/drawingml/2006/main" noChangeAspect="1"/>
             </wp:cNvGraphicFramePr>
@@ -1234,7 +1731,7 @@
               <a:graphicData uri="http://schemas.openxmlformats.org/drawingml/2006/picture">
                 <pic:pic xmlns:pic="http://schemas.openxmlformats.org/drawingml/2006/picture">
                   <pic:nvPicPr>
-                    <pic:cNvPr id="0" name="Picture 1"/>
+                    <pic:cNvPr id="849991639" name="Obrázek 6" descr="Obsah obrázku mapa, text, atlas&#10;&#10;Obsah generovaný pomocí AI může být nesprávný."/>
                     <pic:cNvPicPr>
                       <a:picLocks noChangeAspect="1" noChangeArrowheads="1"/>
                     </pic:cNvPicPr>
@@ -1255,7 +1752,7 @@
                   <pic:spPr bwMode="auto">
                     <a:xfrm>
                       <a:off x="0" y="0"/>
-                      <a:ext cx="2601260" cy="1623922"/>
+                      <a:ext cx="3094879" cy="2090895"/>
                     </a:xfrm>
                     <a:prstGeom prst="rect">
                       <a:avLst/>
@@ -1275,26 +1772,16 @@
         <w:rPr>
           <w:b/>
           <w:bCs/>
-          <w:color w:val="2E5396"/>
-          <w:sz w:val="32"/>
-          <w:szCs w:val="32"/>
-        </w:rPr>
-        <w:t xml:space="preserve"> </w:t>
-      </w:r>
-      <w:r>
-        <w:rPr>
-          <w:b/>
-          <w:bCs/>
           <w:noProof/>
           <w:color w:val="2E5396"/>
           <w:sz w:val="32"/>
           <w:szCs w:val="32"/>
         </w:rPr>
         <w:drawing>
-          <wp:inline distT="0" distB="0" distL="0" distR="0" wp14:anchorId="44E335E1" wp14:editId="022284B1">
-            <wp:extent cx="2673350" cy="1620367"/>
+          <wp:inline distT="0" distB="0" distL="0" distR="0" wp14:anchorId="411F65A7" wp14:editId="6D4BC2E8">
+            <wp:extent cx="3372485" cy="2044126"/>
             <wp:effectExtent l="0" t="0" r="0" b="0"/>
-            <wp:docPr id="1759909250" name="Obrázek 2"/>
+            <wp:docPr id="1785166451" name="Obrázek 5" descr="Obsah obrázku mapa, text, atlas&#10;&#10;Obsah generovaný pomocí AI může být nesprávný."/>
             <wp:cNvGraphicFramePr>
               <a:graphicFrameLocks xmlns:a="http://schemas.openxmlformats.org/drawingml/2006/main" noChangeAspect="1"/>
             </wp:cNvGraphicFramePr>
@@ -1302,7 +1789,7 @@
               <a:graphicData uri="http://schemas.openxmlformats.org/drawingml/2006/picture">
                 <pic:pic xmlns:pic="http://schemas.openxmlformats.org/drawingml/2006/picture">
                   <pic:nvPicPr>
-                    <pic:cNvPr id="0" name="Picture 2"/>
+                    <pic:cNvPr id="1785166451" name="Obrázek 5" descr="Obsah obrázku mapa, text, atlas&#10;&#10;Obsah generovaný pomocí AI může být nesprávný."/>
                     <pic:cNvPicPr>
                       <a:picLocks noChangeAspect="1" noChangeArrowheads="1"/>
                     </pic:cNvPicPr>
@@ -1323,7 +1810,7 @@
                   <pic:spPr bwMode="auto">
                     <a:xfrm>
                       <a:off x="0" y="0"/>
-                      <a:ext cx="2710885" cy="1643118"/>
+                      <a:ext cx="3385371" cy="2051936"/>
                     </a:xfrm>
                     <a:prstGeom prst="rect">
                       <a:avLst/>
@@ -1339,28 +1826,6 @@
           </wp:inline>
         </w:drawing>
       </w:r>
-    </w:p>
-    <w:p>
-      <w:pPr>
-        <w:rPr>
-          <w:b/>
-          <w:bCs/>
-          <w:color w:val="2E5396"/>
-          <w:sz w:val="32"/>
-          <w:szCs w:val="32"/>
-        </w:rPr>
-      </w:pPr>
-    </w:p>
-    <w:p>
-      <w:pPr>
-        <w:rPr>
-          <w:b/>
-          <w:bCs/>
-          <w:color w:val="2E5396"/>
-          <w:sz w:val="32"/>
-          <w:szCs w:val="32"/>
-        </w:rPr>
-      </w:pPr>
       <w:r>
         <w:rPr>
           <w:b/>
@@ -1371,10 +1836,10 @@
           <w:szCs w:val="32"/>
         </w:rPr>
         <w:drawing>
-          <wp:inline distT="0" distB="0" distL="0" distR="0" wp14:anchorId="773730B7" wp14:editId="08DDAE82">
-            <wp:extent cx="2590738" cy="1543050"/>
-            <wp:effectExtent l="0" t="0" r="635" b="0"/>
-            <wp:docPr id="1240776969" name="Obrázek 3"/>
+          <wp:inline distT="0" distB="0" distL="0" distR="0" wp14:anchorId="4AAB36A2" wp14:editId="2AA73FEA">
+            <wp:extent cx="3139902" cy="1816100"/>
+            <wp:effectExtent l="0" t="0" r="3810" b="0"/>
+            <wp:docPr id="325260926" name="Obrázek 4"/>
             <wp:cNvGraphicFramePr>
               <a:graphicFrameLocks xmlns:a="http://schemas.openxmlformats.org/drawingml/2006/main" noChangeAspect="1"/>
             </wp:cNvGraphicFramePr>
@@ -1382,7 +1847,7 @@
               <a:graphicData uri="http://schemas.openxmlformats.org/drawingml/2006/picture">
                 <pic:pic xmlns:pic="http://schemas.openxmlformats.org/drawingml/2006/picture">
                   <pic:nvPicPr>
-                    <pic:cNvPr id="0" name="Picture 3"/>
+                    <pic:cNvPr id="0" name="Picture 4"/>
                     <pic:cNvPicPr>
                       <a:picLocks noChangeAspect="1" noChangeArrowheads="1"/>
                     </pic:cNvPicPr>
@@ -1403,7 +1868,7 @@
                   <pic:spPr bwMode="auto">
                     <a:xfrm>
                       <a:off x="0" y="0"/>
-                      <a:ext cx="2608715" cy="1553757"/>
+                      <a:ext cx="3154255" cy="1824402"/>
                     </a:xfrm>
                     <a:prstGeom prst="rect">
                       <a:avLst/>
@@ -1423,26 +1888,16 @@
         <w:rPr>
           <w:b/>
           <w:bCs/>
-          <w:color w:val="2E5396"/>
-          <w:sz w:val="32"/>
-          <w:szCs w:val="32"/>
-        </w:rPr>
-        <w:t xml:space="preserve"> </w:t>
-      </w:r>
-      <w:r>
-        <w:rPr>
-          <w:b/>
-          <w:bCs/>
           <w:noProof/>
           <w:color w:val="2E5396"/>
           <w:sz w:val="32"/>
           <w:szCs w:val="32"/>
         </w:rPr>
         <w:drawing>
-          <wp:inline distT="0" distB="0" distL="0" distR="0" wp14:anchorId="2AB1998A" wp14:editId="5D613BB6">
-            <wp:extent cx="3127214" cy="1536700"/>
-            <wp:effectExtent l="0" t="0" r="0" b="6350"/>
-            <wp:docPr id="2137306068" name="Obrázek 4"/>
+          <wp:inline distT="0" distB="0" distL="0" distR="0" wp14:anchorId="26274197" wp14:editId="038544A6">
+            <wp:extent cx="3372485" cy="1647552"/>
+            <wp:effectExtent l="0" t="0" r="0" b="0"/>
+            <wp:docPr id="991938608" name="Obrázek 3" descr="Obsah obrázku mapa, text, atlas&#10;&#10;Obsah generovaný pomocí AI může být nesprávný."/>
             <wp:cNvGraphicFramePr>
               <a:graphicFrameLocks xmlns:a="http://schemas.openxmlformats.org/drawingml/2006/main" noChangeAspect="1"/>
             </wp:cNvGraphicFramePr>
@@ -1450,7 +1905,7 @@
               <a:graphicData uri="http://schemas.openxmlformats.org/drawingml/2006/picture">
                 <pic:pic xmlns:pic="http://schemas.openxmlformats.org/drawingml/2006/picture">
                   <pic:nvPicPr>
-                    <pic:cNvPr id="0" name="Picture 4"/>
+                    <pic:cNvPr id="991938608" name="Obrázek 3" descr="Obsah obrázku mapa, text, atlas&#10;&#10;Obsah generovaný pomocí AI může být nesprávný."/>
                     <pic:cNvPicPr>
                       <a:picLocks noChangeAspect="1" noChangeArrowheads="1"/>
                     </pic:cNvPicPr>
@@ -1471,7 +1926,7 @@
                   <pic:spPr bwMode="auto">
                     <a:xfrm>
                       <a:off x="0" y="0"/>
-                      <a:ext cx="3145975" cy="1545919"/>
+                      <a:ext cx="3410221" cy="1665987"/>
                     </a:xfrm>
                     <a:prstGeom prst="rect">
                       <a:avLst/>
@@ -1487,28 +1942,6 @@
           </wp:inline>
         </w:drawing>
       </w:r>
-    </w:p>
-    <w:p>
-      <w:pPr>
-        <w:rPr>
-          <w:b/>
-          <w:bCs/>
-          <w:color w:val="2E5396"/>
-          <w:sz w:val="32"/>
-          <w:szCs w:val="32"/>
-        </w:rPr>
-      </w:pPr>
-    </w:p>
-    <w:p>
-      <w:pPr>
-        <w:rPr>
-          <w:b/>
-          <w:bCs/>
-          <w:color w:val="2E5396"/>
-          <w:sz w:val="32"/>
-          <w:szCs w:val="32"/>
-        </w:rPr>
-      </w:pPr>
       <w:r>
         <w:rPr>
           <w:b/>
@@ -1519,10 +1952,10 @@
           <w:szCs w:val="32"/>
         </w:rPr>
         <w:drawing>
-          <wp:inline distT="0" distB="0" distL="0" distR="0" wp14:anchorId="748E1E49" wp14:editId="3D230FE8">
-            <wp:extent cx="2863850" cy="1670123"/>
-            <wp:effectExtent l="0" t="0" r="0" b="6350"/>
-            <wp:docPr id="2092691299" name="Obrázek 5"/>
+          <wp:inline distT="0" distB="0" distL="0" distR="0" wp14:anchorId="3E90877C" wp14:editId="04377FF6">
+            <wp:extent cx="3182459" cy="1968500"/>
+            <wp:effectExtent l="0" t="0" r="0" b="0"/>
+            <wp:docPr id="1770095165" name="Obrázek 2" descr="Obsah obrázku mapa, text, atlas&#10;&#10;Obsah generovaný pomocí AI může být nesprávný."/>
             <wp:cNvGraphicFramePr>
               <a:graphicFrameLocks xmlns:a="http://schemas.openxmlformats.org/drawingml/2006/main" noChangeAspect="1"/>
             </wp:cNvGraphicFramePr>
@@ -1530,13 +1963,13 @@
               <a:graphicData uri="http://schemas.openxmlformats.org/drawingml/2006/picture">
                 <pic:pic xmlns:pic="http://schemas.openxmlformats.org/drawingml/2006/picture">
                   <pic:nvPicPr>
-                    <pic:cNvPr id="0" name="Picture 5"/>
+                    <pic:cNvPr id="1770095165" name="Obrázek 2" descr="Obsah obrázku mapa, text, atlas&#10;&#10;Obsah generovaný pomocí AI může být nesprávný."/>
                     <pic:cNvPicPr>
                       <a:picLocks noChangeAspect="1" noChangeArrowheads="1"/>
                     </pic:cNvPicPr>
                   </pic:nvPicPr>
                   <pic:blipFill>
-                    <a:blip r:embed="rId12" cstate="print">
+                    <a:blip r:embed="rId12">
                       <a:extLst>
                         <a:ext uri="{28A0092B-C50C-407E-A947-70E740481C1C}">
                           <a14:useLocalDpi xmlns:a14="http://schemas.microsoft.com/office/drawing/2010/main" val="0"/>
@@ -1551,7 +1984,7 @@
                   <pic:spPr bwMode="auto">
                     <a:xfrm>
                       <a:off x="0" y="0"/>
-                      <a:ext cx="2886354" cy="1683247"/>
+                      <a:ext cx="3205996" cy="1983058"/>
                     </a:xfrm>
                     <a:prstGeom prst="rect">
                       <a:avLst/>
@@ -1571,26 +2004,16 @@
         <w:rPr>
           <w:b/>
           <w:bCs/>
-          <w:color w:val="2E5396"/>
-          <w:sz w:val="32"/>
-          <w:szCs w:val="32"/>
-        </w:rPr>
-        <w:t xml:space="preserve"> </w:t>
-      </w:r>
-      <w:r>
-        <w:rPr>
-          <w:b/>
-          <w:bCs/>
           <w:noProof/>
           <w:color w:val="2E5396"/>
           <w:sz w:val="32"/>
           <w:szCs w:val="32"/>
         </w:rPr>
         <w:drawing>
-          <wp:inline distT="0" distB="0" distL="0" distR="0" wp14:anchorId="0819D775" wp14:editId="5895B5F4">
-            <wp:extent cx="2876550" cy="1672029"/>
-            <wp:effectExtent l="0" t="0" r="0" b="4445"/>
-            <wp:docPr id="482798078" name="Obrázek 6"/>
+          <wp:inline distT="0" distB="0" distL="0" distR="0" wp14:anchorId="09D381F6" wp14:editId="070C366A">
+            <wp:extent cx="3314700" cy="1971074"/>
+            <wp:effectExtent l="0" t="0" r="0" b="0"/>
+            <wp:docPr id="1814711199" name="Obrázek 1" descr="Obsah obrázku mapa, text, atlas&#10;&#10;Obsah generovaný pomocí AI může být nesprávný."/>
             <wp:cNvGraphicFramePr>
               <a:graphicFrameLocks xmlns:a="http://schemas.openxmlformats.org/drawingml/2006/main" noChangeAspect="1"/>
             </wp:cNvGraphicFramePr>
@@ -1598,7 +2021,7 @@
               <a:graphicData uri="http://schemas.openxmlformats.org/drawingml/2006/picture">
                 <pic:pic xmlns:pic="http://schemas.openxmlformats.org/drawingml/2006/picture">
                   <pic:nvPicPr>
-                    <pic:cNvPr id="0" name="Picture 6"/>
+                    <pic:cNvPr id="1814711199" name="Obrázek 1" descr="Obsah obrázku mapa, text, atlas&#10;&#10;Obsah generovaný pomocí AI může být nesprávný."/>
                     <pic:cNvPicPr>
                       <a:picLocks noChangeAspect="1" noChangeArrowheads="1"/>
                     </pic:cNvPicPr>
@@ -1619,7 +2042,7 @@
                   <pic:spPr bwMode="auto">
                     <a:xfrm>
                       <a:off x="0" y="0"/>
-                      <a:ext cx="2918542" cy="1696437"/>
+                      <a:ext cx="3337267" cy="1984493"/>
                     </a:xfrm>
                     <a:prstGeom prst="rect">
                       <a:avLst/>
@@ -1678,10 +2101,10 @@
           <w:szCs w:val="32"/>
         </w:rPr>
         <w:drawing>
-          <wp:inline distT="0" distB="0" distL="0" distR="0" wp14:anchorId="724618D2" wp14:editId="5C70C748">
-            <wp:extent cx="6645910" cy="2190115"/>
-            <wp:effectExtent l="0" t="0" r="2540" b="635"/>
-            <wp:docPr id="828078816" name="Obrázek 1" descr="Obsah obrázku text, kalendář, číslo, čtverec&#10;&#10;Obsah generovaný pomocí AI může být nesprávný."/>
+          <wp:inline distT="0" distB="0" distL="0" distR="0" wp14:anchorId="1CE72A28" wp14:editId="7DA797E8">
+            <wp:extent cx="6645910" cy="2208530"/>
+            <wp:effectExtent l="0" t="0" r="2540" b="1270"/>
+            <wp:docPr id="1977190382" name="Obrázek 1" descr="Obsah obrázku text, číslo, snímek obrazovky, kalendář&#10;&#10;Obsah generovaný pomocí AI může být nesprávný."/>
             <wp:cNvGraphicFramePr>
               <a:graphicFrameLocks xmlns:a="http://schemas.openxmlformats.org/drawingml/2006/main" noChangeAspect="1"/>
             </wp:cNvGraphicFramePr>
@@ -1689,7 +2112,7 @@
               <a:graphicData uri="http://schemas.openxmlformats.org/drawingml/2006/picture">
                 <pic:pic xmlns:pic="http://schemas.openxmlformats.org/drawingml/2006/picture">
                   <pic:nvPicPr>
-                    <pic:cNvPr id="828078816" name="Obrázek 1" descr="Obsah obrázku text, kalendář, číslo, čtverec&#10;&#10;Obsah generovaný pomocí AI může být nesprávný."/>
+                    <pic:cNvPr id="1977190382" name="Obrázek 1" descr="Obsah obrázku text, číslo, snímek obrazovky, kalendář&#10;&#10;Obsah generovaný pomocí AI může být nesprávný."/>
                     <pic:cNvPicPr/>
                   </pic:nvPicPr>
                   <pic:blipFill>
@@ -1701,7 +2124,7 @@
                   <pic:spPr>
                     <a:xfrm>
                       <a:off x="0" y="0"/>
-                      <a:ext cx="6645910" cy="2190115"/>
+                      <a:ext cx="6645910" cy="2208530"/>
                     </a:xfrm>
                     <a:prstGeom prst="rect">
                       <a:avLst/>
@@ -1713,6 +2136,17 @@
           </wp:inline>
         </w:drawing>
       </w:r>
+      <w:r>
+        <w:rPr>
+          <w:b/>
+          <w:bCs/>
+          <w:noProof/>
+          <w:color w:val="2E5396"/>
+          <w:sz w:val="32"/>
+          <w:szCs w:val="32"/>
+        </w:rPr>
+        <w:t xml:space="preserve"> </w:t>
+      </w:r>
     </w:p>
     <w:p>
       <w:pPr>
@@ -10455,7 +10889,23 @@
           <w:i/>
           <w:iCs/>
         </w:rPr>
-        <w:t xml:space="preserve">: 90% by </w:t>
+        <w:t xml:space="preserve">: </w:t>
+      </w:r>
+      <w:proofErr w:type="gramStart"/>
+      <w:r>
+        <w:rPr>
+          <w:i/>
+          <w:iCs/>
+        </w:rPr>
+        <w:t>90%</w:t>
+      </w:r>
+      <w:proofErr w:type="gramEnd"/>
+      <w:r>
+        <w:rPr>
+          <w:i/>
+          <w:iCs/>
+        </w:rPr>
+        <w:t xml:space="preserve"> by </w:t>
       </w:r>
       <w:proofErr w:type="spellStart"/>
       <w:r>
@@ -10503,7 +10953,23 @@
           <w:i/>
           <w:iCs/>
         </w:rPr>
-        <w:t xml:space="preserve">, 10% by </w:t>
+        <w:t xml:space="preserve">, </w:t>
+      </w:r>
+      <w:proofErr w:type="gramStart"/>
+      <w:r>
+        <w:rPr>
+          <w:i/>
+          <w:iCs/>
+        </w:rPr>
+        <w:t>10%</w:t>
+      </w:r>
+      <w:proofErr w:type="gramEnd"/>
+      <w:r>
+        <w:rPr>
+          <w:i/>
+          <w:iCs/>
+        </w:rPr>
+        <w:t xml:space="preserve"> by </w:t>
       </w:r>
       <w:proofErr w:type="spellStart"/>
       <w:r>
@@ -10599,7 +11065,23 @@
           <w:i/>
           <w:iCs/>
         </w:rPr>
-        <w:t xml:space="preserve"> 10%, </w:t>
+        <w:t xml:space="preserve"> </w:t>
+      </w:r>
+      <w:proofErr w:type="gramStart"/>
+      <w:r>
+        <w:rPr>
+          <w:i/>
+          <w:iCs/>
+        </w:rPr>
+        <w:t>10%</w:t>
+      </w:r>
+      <w:proofErr w:type="gramEnd"/>
+      <w:r>
+        <w:rPr>
+          <w:i/>
+          <w:iCs/>
+        </w:rPr>
+        <w:t xml:space="preserve">, </w:t>
       </w:r>
       <w:proofErr w:type="spellStart"/>
       <w:r>
@@ -12680,6 +13162,7 @@
   </w:style>
   <w:style w:type="paragraph" w:styleId="Nadpis2">
     <w:name w:val="heading 2"/>
+    <w:link w:val="Nadpis2Char"/>
     <w:uiPriority w:val="9"/>
     <w:unhideWhenUsed/>
     <w:qFormat/>
@@ -12841,6 +13324,36 @@
       <w:sz w:val="20"/>
       <w:szCs w:val="20"/>
     </w:rPr>
+  </w:style>
+  <w:style w:type="character" w:customStyle="1" w:styleId="Nadpis2Char">
+    <w:name w:val="Nadpis 2 Char"/>
+    <w:basedOn w:val="Standardnpsmoodstavce"/>
+    <w:link w:val="Nadpis2"/>
+    <w:uiPriority w:val="9"/>
+    <w:rsid w:val="00115403"/>
+    <w:rPr>
+      <w:b/>
+      <w:bCs/>
+      <w:color w:val="2E5396"/>
+      <w:sz w:val="28"/>
+      <w:szCs w:val="28"/>
+    </w:rPr>
+  </w:style>
+  <w:style w:type="table" w:styleId="Mkatabulky">
+    <w:name w:val="Table Grid"/>
+    <w:basedOn w:val="Normlntabulka"/>
+    <w:uiPriority w:val="39"/>
+    <w:rsid w:val="00895A19"/>
+    <w:tblPr>
+      <w:tblBorders>
+        <w:top w:val="single" w:sz="4" w:space="0" w:color="auto"/>
+        <w:left w:val="single" w:sz="4" w:space="0" w:color="auto"/>
+        <w:bottom w:val="single" w:sz="4" w:space="0" w:color="auto"/>
+        <w:right w:val="single" w:sz="4" w:space="0" w:color="auto"/>
+        <w:insideH w:val="single" w:sz="4" w:space="0" w:color="auto"/>
+        <w:insideV w:val="single" w:sz="4" w:space="0" w:color="auto"/>
+      </w:tblBorders>
+    </w:tblPr>
   </w:style>
 </w:styles>
 </file>

</xml_diff>